<commit_message>
docs(deliverables): regenerate review report + pitch deck with wave-5 stats (402 fitments, 74 products); publish review copies at /report-v2/
</commit_message>
<xml_diff>
--- a/report-v2/Vehicle_Selector_Pro_Project_Report.docx
+++ b/report-v2/Vehicle_Selector_Pro_Project_Report.docx
@@ -104,7 +104,7 @@
           <w:color w:val="282A2E"/>
           <w:sz w:val="22"/>
         </w:rPr>
-        <w:t>Normalized local cache — Fitments live in structured ActiveRecord tables (48 YMMTE configurations, 318 verified fitments, 54 products, 25 brands in the demo), so filtering is instant and never pounds Shopify's API.</w:t>
+        <w:t>Normalized local cache — Fitments live in structured ActiveRecord tables (48 YMMTE configurations, 402 verified fitments, 74 products, 25 brands in the demo), so filtering is instant and never pounds Shopify's API.</w:t>
       </w:r>
     </w:p>
     <w:p>
@@ -203,7 +203,7 @@
           <w:b w:val="0"/>
           <w:sz w:val="22"/>
         </w:rPr>
-        <w:t>Fitments live in structured ActiveRecord tables (48 YMMTE configurations, 318 verified fitments, 54 products, 25 brands in the demo), so filtering is instant and never pounds Shopify's API.</w:t>
+        <w:t>Fitments live in structured ActiveRecord tables (48 YMMTE configurations, 402 verified fitments, 74 products, 25 brands in the demo), so filtering is instant and never pounds Shopify's API.</w:t>
       </w:r>
     </w:p>
     <w:p>
@@ -1279,7 +1279,7 @@
                 <w:b/>
                 <w:color w:val="E04B33"/>
               </w:rPr>
-              <w:t>204</w:t>
+              <w:t>402</w:t>
             </w:r>
           </w:p>
         </w:tc>
@@ -1305,7 +1305,7 @@
                 <w:b/>
                 <w:color w:val="E04B33"/>
               </w:rPr>
-              <w:t>40</w:t>
+              <w:t>74</w:t>
             </w:r>
           </w:p>
         </w:tc>

</xml_diff>